<commit_message>
done 99 perc doc 2, added all placeholders, optional fields, custom labels, accessor and helpers in project model
</commit_message>
<xml_diff>
--- a/public/docs/Bid Evaluation Report.docx
+++ b/public/docs/Bid Evaluation Report.docx
@@ -1337,7 +1337,7 @@
                 <w:sz w:val="22"/>
                 <w:szCs w:val="22"/>
               </w:rPr>
-              <w:t>July 15, 2025</w:t>
+              <w:t>{{date_of_publication_capitalize}}</w:t>
             </w:r>
           </w:p>
           <w:p>
@@ -1477,33 +1477,25 @@
                 <w:sz w:val="22"/>
                 <w:szCs w:val="22"/>
               </w:rPr>
-              <w:t>August 4, 2025</w:t>
-            </w:r>
-          </w:p>
-          <w:p>
-            <w:pPr>
-              <w:pStyle w:val="Normal"/>
-              <w:rPr>
-                <w:rFonts w:ascii="Verdana" w:hAnsi="Verdana"/>
-                <w:sz w:val="22"/>
-                <w:szCs w:val="22"/>
-              </w:rPr>
-            </w:pPr>
-            <w:r>
-              <w:rPr>
-                <w:rFonts w:ascii="Verdana" w:hAnsi="Verdana"/>
-                <w:sz w:val="22"/>
-                <w:szCs w:val="22"/>
-              </w:rPr>
-              <w:t xml:space="preserve"> </w:t>
-            </w:r>
-            <w:r>
-              <w:rPr>
-                <w:rFonts w:ascii="Verdana" w:hAnsi="Verdana"/>
-                <w:sz w:val="22"/>
-                <w:szCs w:val="22"/>
-              </w:rPr>
-              <w:t>One (1)</w:t>
+              <w:t>{{date_of_eligibility_capitalize}}</w:t>
+            </w:r>
+          </w:p>
+          <w:p>
+            <w:pPr>
+              <w:pStyle w:val="Normal"/>
+              <w:rPr>
+                <w:rFonts w:ascii="Verdana" w:hAnsi="Verdana"/>
+                <w:sz w:val="22"/>
+                <w:szCs w:val="22"/>
+              </w:rPr>
+            </w:pPr>
+            <w:r>
+              <w:rPr>
+                <w:rFonts w:ascii="Verdana" w:hAnsi="Verdana"/>
+                <w:sz w:val="22"/>
+                <w:szCs w:val="22"/>
+              </w:rPr>
+              <w:t>{{num_of_eligibility_capitalize}}</w:t>
             </w:r>
           </w:p>
           <w:p>
@@ -1628,38 +1620,24 @@
               </w:rPr>
               <w:t xml:space="preserve"> </w:t>
             </w:r>
-            <w:r>
-              <w:rPr>
-                <w:rFonts w:ascii="Verdana" w:hAnsi="Verdana"/>
-                <w:sz w:val="22"/>
-                <w:szCs w:val="22"/>
-              </w:rPr>
-              <w:t xml:space="preserve">July 15 </w:t>
-            </w:r>
-            <w:r>
-              <w:rPr>
+          </w:p>
+          <w:p>
+            <w:pPr>
+              <w:pStyle w:val="Normal"/>
+              <w:rPr>
+                <w:rFonts w:ascii="Verdana" w:hAnsi="Verdana"/>
+                <w:sz w:val="22"/>
+                <w:szCs w:val="22"/>
+              </w:rPr>
+            </w:pPr>
+            <w:r>
+              <w:rPr>
+                <w:rFonts w:ascii="Verdana" w:hAnsi="Verdana"/>
                 <w:iCs/>
                 <w:sz w:val="22"/>
                 <w:szCs w:val="22"/>
               </w:rPr>
-              <w:t xml:space="preserve">- </w:t>
-            </w:r>
-            <w:r>
-              <w:rPr>
-                <w:rFonts w:ascii="Verdana" w:hAnsi="Verdana"/>
-                <w:sz w:val="22"/>
-                <w:szCs w:val="22"/>
-              </w:rPr>
-              <w:t xml:space="preserve">August 4, </w:t>
-            </w:r>
-            <w:r>
-              <w:rPr>
-                <w:rFonts w:ascii="Verdana" w:hAnsi="Verdana"/>
-                <w:iCs/>
-                <w:sz w:val="22"/>
-                <w:szCs w:val="22"/>
-              </w:rPr>
-              <w:t>2025</w:t>
+              <w:t>{{period_of_availability_capitalize}}</w:t>
             </w:r>
           </w:p>
           <w:p>
@@ -1688,7 +1666,7 @@
                 <w:szCs w:val="22"/>
                 <w:u w:val="none"/>
               </w:rPr>
-              <w:t>One (1)</w:t>
+              <w:t>{{num_of_docs_issued_capitalize}}</w:t>
             </w:r>
           </w:p>
         </w:tc>
@@ -1874,7 +1852,7 @@
                 <w:sz w:val="22"/>
                 <w:szCs w:val="22"/>
               </w:rPr>
-              <w:t>July 22, 2025</w:t>
+              <w:t>{{date_of_conference_capitalize}}</w:t>
             </w:r>
           </w:p>
           <w:p>
@@ -2362,7 +2340,25 @@
                 <w:sz w:val="22"/>
                 <w:szCs w:val="22"/>
               </w:rPr>
-              <w:t>August 4, 2025, at 8:30 am</w:t>
+              <w:t>{{orig_date_time_capitalize}}</w:t>
+            </w:r>
+          </w:p>
+          <w:p>
+            <w:pPr>
+              <w:pStyle w:val="Normal"/>
+              <w:rPr>
+                <w:rFonts w:ascii="Verdana" w:hAnsi="Verdana"/>
+                <w:sz w:val="22"/>
+                <w:szCs w:val="22"/>
+              </w:rPr>
+            </w:pPr>
+            <w:r>
+              <w:rPr>
+                <w:rFonts w:ascii="Verdana" w:hAnsi="Verdana"/>
+                <w:sz w:val="22"/>
+                <w:szCs w:val="22"/>
+              </w:rPr>
+              <w:t>{{extension_capitalize}}</w:t>
             </w:r>
           </w:p>
           <w:p>
@@ -2441,7 +2437,7 @@
                 <w:sz w:val="22"/>
                 <w:szCs w:val="22"/>
               </w:rPr>
-              <w:t>August 4, 2025, at 10:00am</w:t>
+              <w:t>{{bid_opening_date_time_capitalize}}</w:t>
             </w:r>
           </w:p>
         </w:tc>
@@ -2558,7 +2554,7 @@
                 <w:sz w:val="22"/>
                 <w:szCs w:val="22"/>
               </w:rPr>
-              <w:t>One (1) Bidding document</w:t>
+              <w:t>{{num_submitted_bids_capitalize}} Bidding document</w:t>
             </w:r>
           </w:p>
         </w:tc>
@@ -2665,7 +2661,42 @@
                 <w:sz w:val="22"/>
                 <w:szCs w:val="22"/>
               </w:rPr>
-              <w:t>120c.d.</w:t>
+              <w:t>{{orig_specified}}c.d.</w:t>
+            </w:r>
+          </w:p>
+          <w:p>
+            <w:pPr>
+              <w:pStyle w:val="Normal"/>
+              <w:rPr>
+                <w:rFonts w:ascii="Verdana" w:hAnsi="Verdana"/>
+                <w:sz w:val="22"/>
+                <w:szCs w:val="22"/>
+              </w:rPr>
+            </w:pPr>
+            <w:r>
+              <w:rPr>
+                <w:rFonts w:ascii="Verdana" w:hAnsi="Verdana"/>
+                <w:sz w:val="22"/>
+                <w:szCs w:val="22"/>
+              </w:rPr>
+            </w:r>
+          </w:p>
+          <w:p>
+            <w:pPr>
+              <w:pStyle w:val="Normal"/>
+              <w:rPr>
+                <w:rFonts w:ascii="Verdana" w:hAnsi="Verdana"/>
+                <w:sz w:val="22"/>
+                <w:szCs w:val="22"/>
+              </w:rPr>
+            </w:pPr>
+            <w:r>
+              <w:rPr>
+                <w:rFonts w:ascii="Verdana" w:hAnsi="Verdana"/>
+                <w:sz w:val="22"/>
+                <w:szCs w:val="22"/>
+              </w:rPr>
+              <w:t>{{extension_revision_capitalize}}</w:t>
             </w:r>
           </w:p>
         </w:tc>
@@ -2693,12 +2724,14 @@
         <w:ind w:start="0"/>
         <w:jc w:val="center"/>
         <w:rPr>
-          <w:sz w:val="22"/>
-          <w:szCs w:val="22"/>
-        </w:rPr>
-      </w:pPr>
-      <w:r>
-        <w:rPr>
+          <w:b w:val="false"/>
+          <w:bCs w:val="false"/>
+        </w:rPr>
+      </w:pPr>
+      <w:r>
+        <w:rPr>
+          <w:b w:val="false"/>
+          <w:bCs w:val="false"/>
           <w:sz w:val="22"/>
           <w:szCs w:val="22"/>
         </w:rPr>
@@ -2935,17 +2968,25 @@
               <w:t xml:space="preserve">PHP </w:t>
             </w:r>
             <w:bookmarkStart w:id="3" w:name="bmAmountFigures"/>
-            <w:r>
-              <w:rPr>
-                <w:rFonts w:ascii="Verdana" w:hAnsi="Verdana"/>
-                <w:sz w:val="22"/>
-                <w:szCs w:val="22"/>
-              </w:rPr>
-              <w:t>4,489,974.39</w:t>
-            </w:r>
             <w:bookmarkStart w:id="4" w:name="_Hlk43370318"/>
+            <w:bookmarkEnd w:id="4"/>
+            <w:r>
+              <w:rPr>
+                <w:rFonts w:ascii="Verdana" w:hAnsi="Verdana"/>
+                <w:sz w:val="22"/>
+                <w:szCs w:val="22"/>
+              </w:rPr>
+              <w:t>{</w:t>
+            </w:r>
             <w:bookmarkEnd w:id="3"/>
-            <w:bookmarkEnd w:id="4"/>
+            <w:r>
+              <w:rPr>
+                <w:rFonts w:ascii="Verdana" w:hAnsi="Verdana"/>
+                <w:sz w:val="22"/>
+                <w:szCs w:val="22"/>
+              </w:rPr>
+              <w:t>{contract_read_amount}}</w:t>
+            </w:r>
           </w:p>
         </w:tc>
       </w:tr>
@@ -3020,25 +3061,28 @@
     <w:p>
       <w:pPr>
         <w:pStyle w:val="Normal"/>
-        <w:spacing w:lineRule="auto" w:line="259" w:before="0" w:after="160"/>
-        <w:contextualSpacing/>
         <w:jc w:val="both"/>
-        <w:rPr>
-          <w:rFonts w:ascii="Verdana" w:hAnsi="Verdana" w:eastAsia="Calibri" w:cs="Calibri"/>
+        <w:rPr/>
+      </w:pPr>
+      <w:r>
+        <w:rPr>
+          <w:rFonts w:ascii="Verdana" w:hAnsi="Verdana"/>
+          <w:b w:val="false"/>
+          <w:bCs w:val="false"/>
+          <w:sz w:val="22"/>
+          <w:szCs w:val="22"/>
+        </w:rPr>
+        <w:t>It appeared that</w:t>
+      </w:r>
+      <w:r>
+        <w:rPr>
+          <w:rFonts w:ascii="Verdana" w:hAnsi="Verdana"/>
           <w:b/>
           <w:bCs/>
           <w:sz w:val="22"/>
           <w:szCs w:val="22"/>
-          <w:lang w:val="en-PH"/>
-        </w:rPr>
-      </w:pPr>
-      <w:r>
-        <w:rPr>
-          <w:rFonts w:ascii="Verdana" w:hAnsi="Verdana"/>
-          <w:sz w:val="22"/>
-          <w:szCs w:val="22"/>
-        </w:rPr>
-        <w:t>It appeared that</w:t>
+        </w:rPr>
+        <w:t xml:space="preserve"> {{company_name_upper}} </w:t>
       </w:r>
       <w:r>
         <w:rPr>
@@ -3048,7 +3092,7 @@
           <w:sz w:val="22"/>
           <w:szCs w:val="22"/>
         </w:rPr>
-        <w:t xml:space="preserve"> </w:t>
+        <w:t>submitted the Lowest Calculated Bid, offering the amounf of</w:t>
       </w:r>
       <w:r>
         <w:rPr>
@@ -3058,132 +3102,79 @@
           <w:sz w:val="22"/>
           <w:szCs w:val="22"/>
         </w:rPr>
-        <w:t>{{company_name_upper}}</w:t>
-      </w:r>
-      <w:r>
-        <w:rPr>
-          <w:rFonts w:cs="Tahoma" w:ascii="Verdana" w:hAnsi="Verdana"/>
+        <w:t xml:space="preserve"> {{contract_amount_words}} (PHP {{contract_calculated_amount}})</w:t>
+      </w:r>
+      <w:r>
+        <w:rPr>
+          <w:rFonts w:ascii="Verdana" w:hAnsi="Verdana"/>
           <w:b w:val="false"/>
           <w:bCs w:val="false"/>
           <w:sz w:val="22"/>
-          <w:szCs w:val="24"/>
+          <w:szCs w:val="22"/>
+        </w:rPr>
+        <w:t xml:space="preserve">. Considering that the bidder mentioned above complied and submitted the required documents and in as much as the </w:t>
+      </w:r>
+      <w:r>
+        <w:rPr>
+          <w:rFonts w:ascii="Verdana" w:hAnsi="Verdana"/>
+          <w:b/>
+          <w:bCs/>
+          <w:sz w:val="22"/>
+          <w:szCs w:val="22"/>
+        </w:rPr>
+        <w:t>ABC is Php</w:t>
+      </w:r>
+      <w:r>
+        <w:rPr>
+          <w:rFonts w:ascii="Verdana" w:hAnsi="Verdana"/>
+          <w:b w:val="false"/>
+          <w:bCs w:val="false"/>
+          <w:sz w:val="22"/>
+          <w:szCs w:val="22"/>
         </w:rPr>
         <w:t xml:space="preserve"> </w:t>
       </w:r>
       <w:r>
         <w:rPr>
           <w:rFonts w:ascii="Verdana" w:hAnsi="Verdana"/>
-          <w:sz w:val="22"/>
-          <w:szCs w:val="22"/>
-        </w:rPr>
-        <w:t xml:space="preserve">submitted the Lowest Calculated Bid, offering the amount of </w:t>
-      </w:r>
-      <w:bookmarkStart w:id="5" w:name="bmBidAmountWords"/>
-      <w:r>
-        <w:rPr>
-          <w:rFonts w:ascii="Verdana" w:hAnsi="Verdana"/>
           <w:b/>
-          <w:sz w:val="22"/>
-          <w:szCs w:val="24"/>
-        </w:rPr>
-        <w:t>Four Million</w:t>
-      </w:r>
-      <w:r>
-        <w:rPr>
-          <w:rFonts w:ascii="Verdana" w:hAnsi="Verdana"/>
-          <w:sz w:val="22"/>
-          <w:szCs w:val="24"/>
-        </w:rPr>
-        <w:t xml:space="preserve"> </w:t>
-      </w:r>
-      <w:r>
-        <w:rPr>
-          <w:rFonts w:ascii="Verdana" w:hAnsi="Verdana"/>
-          <w:b/>
-          <w:sz w:val="22"/>
-        </w:rPr>
-        <w:t>Four Hundred Eighty-Nine Thousand Nine Hundred Seventy-Four Pesos and 39/100</w:t>
-      </w:r>
-      <w:bookmarkEnd w:id="5"/>
-      <w:r>
-        <w:rPr>
-          <w:rFonts w:ascii="Verdana" w:hAnsi="Verdana"/>
-          <w:b/>
-          <w:sz w:val="22"/>
-        </w:rPr>
-        <w:t xml:space="preserve"> </w:t>
-      </w:r>
-      <w:r>
-        <w:rPr>
-          <w:rFonts w:ascii="Verdana" w:hAnsi="Verdana"/>
-          <w:b/>
-          <w:sz w:val="22"/>
-          <w:szCs w:val="24"/>
-        </w:rPr>
-        <w:t xml:space="preserve"> (PHP </w:t>
-      </w:r>
-      <w:bookmarkStart w:id="6" w:name="bmAmountFigures2"/>
-      <w:r>
-        <w:rPr>
-          <w:rFonts w:ascii="Verdana" w:hAnsi="Verdana"/>
-          <w:b/>
-          <w:sz w:val="22"/>
-          <w:szCs w:val="24"/>
-        </w:rPr>
-        <w:t>4,489,974.39</w:t>
-      </w:r>
-      <w:bookmarkEnd w:id="6"/>
-      <w:r>
-        <w:rPr>
-          <w:rFonts w:ascii="Verdana" w:hAnsi="Verdana"/>
-          <w:b/>
-          <w:sz w:val="22"/>
-          <w:szCs w:val="24"/>
-        </w:rPr>
-        <w:t>)</w:t>
-      </w:r>
-      <w:r>
-        <w:rPr>
-          <w:rFonts w:ascii="Verdana" w:hAnsi="Verdana"/>
-          <w:szCs w:val="22"/>
-        </w:rPr>
-        <w:t xml:space="preserve">. </w:t>
-      </w:r>
-      <w:r>
-        <w:rPr>
-          <w:rFonts w:ascii="Verdana" w:hAnsi="Verdana"/>
-          <w:sz w:val="22"/>
-          <w:szCs w:val="22"/>
-        </w:rPr>
-        <w:t xml:space="preserve">Considering that the bidder mentioned above complied and submitted the required documents and in as much as the </w:t>
-      </w:r>
-      <w:r>
-        <w:rPr>
-          <w:rFonts w:ascii="Verdana" w:hAnsi="Verdana"/>
-          <w:b/>
-          <w:sz w:val="22"/>
-          <w:szCs w:val="22"/>
-        </w:rPr>
-        <w:t xml:space="preserve">ABC is Php </w:t>
-      </w:r>
-      <w:bookmarkStart w:id="7" w:name="bmBudget2"/>
-      <w:r>
-        <w:rPr>
-          <w:rFonts w:ascii="Verdana" w:hAnsi="Verdana"/>
-          <w:b/>
-          <w:sz w:val="22"/>
-          <w:szCs w:val="22"/>
-        </w:rPr>
-        <w:t>4,500,000.00</w:t>
-      </w:r>
-      <w:bookmarkEnd w:id="7"/>
-      <w:r>
-        <w:rPr>
-          <w:rFonts w:ascii="Verdana" w:hAnsi="Verdana"/>
+          <w:bCs/>
+          <w:sz w:val="22"/>
+          <w:szCs w:val="22"/>
+        </w:rPr>
+        <w:t>{{approved_budget}}</w:t>
+      </w:r>
+      <w:r>
+        <w:rPr>
+          <w:rFonts w:ascii="Verdana" w:hAnsi="Verdana"/>
+          <w:b w:val="false"/>
+          <w:bCs w:val="false"/>
           <w:sz w:val="22"/>
           <w:szCs w:val="22"/>
         </w:rPr>
         <w:t>, the BAC proceeded with the Post Qualification process.</w:t>
+      </w:r>
+    </w:p>
+    <w:p>
+      <w:pPr>
+        <w:pStyle w:val="Normal"/>
+        <w:jc w:val="both"/>
+        <w:rPr>
+          <w:rFonts w:ascii="Verdana" w:hAnsi="Verdana"/>
+          <w:b w:val="false"/>
+          <w:bCs w:val="false"/>
+          <w:sz w:val="8"/>
+          <w:szCs w:val="8"/>
+        </w:rPr>
+      </w:pPr>
+      <w:r>
+        <w:rPr>
+          <w:rFonts w:ascii="Verdana" w:hAnsi="Verdana"/>
+          <w:b w:val="false"/>
+          <w:bCs w:val="false"/>
+          <w:sz w:val="8"/>
+          <w:szCs w:val="8"/>
+        </w:rPr>
       </w:r>
     </w:p>
     <w:p>
@@ -3380,7 +3371,7 @@
               </w:rPr>
               <w:t>{{company_name_upper}}</w:t>
             </w:r>
-            <w:bookmarkStart w:id="8" w:name="bmCompanyName5"/>
+            <w:bookmarkStart w:id="5" w:name="bmCompanyName5"/>
             <w:r>
               <w:rPr>
                 <w:rFonts w:cs="Tahoma" w:ascii="Verdana" w:hAnsi="Verdana"/>
@@ -3390,7 +3381,7 @@
               </w:rPr>
               <w:t xml:space="preserve"> </w:t>
             </w:r>
-            <w:bookmarkEnd w:id="8"/>
+            <w:bookmarkEnd w:id="5"/>
           </w:p>
         </w:tc>
         <w:tc>
@@ -3420,16 +3411,24 @@
               </w:rPr>
               <w:t xml:space="preserve">PHP </w:t>
             </w:r>
-            <w:bookmarkStart w:id="9" w:name="bmAmountFigures3"/>
-            <w:r>
-              <w:rPr>
-                <w:rFonts w:ascii="Verdana" w:hAnsi="Verdana"/>
-                <w:sz w:val="22"/>
-                <w:szCs w:val="22"/>
-              </w:rPr>
-              <w:t>4,489,974.39</w:t>
-            </w:r>
-            <w:bookmarkEnd w:id="9"/>
+            <w:bookmarkStart w:id="6" w:name="bmAmountFigures3"/>
+            <w:r>
+              <w:rPr>
+                <w:rFonts w:ascii="Verdana" w:hAnsi="Verdana"/>
+                <w:sz w:val="22"/>
+                <w:szCs w:val="22"/>
+              </w:rPr>
+              <w:t>{</w:t>
+            </w:r>
+            <w:bookmarkEnd w:id="6"/>
+            <w:r>
+              <w:rPr>
+                <w:rFonts w:ascii="Verdana" w:hAnsi="Verdana"/>
+                <w:sz w:val="22"/>
+                <w:szCs w:val="22"/>
+              </w:rPr>
+              <w:t>{contract_calculated_amount}}</w:t>
+            </w:r>
           </w:p>
         </w:tc>
       </w:tr>
@@ -3614,7 +3613,17 @@
         <w:tab/>
         <w:tab/>
         <w:tab/>
-        <w:t xml:space="preserve">              BAC Secretariat-Head</w:t>
+        <w:t xml:space="preserve">             </w:t>
+      </w:r>
+      <w:r>
+        <w:rPr>
+          <w:rFonts w:ascii="Verdana" w:hAnsi="Verdana"/>
+          <w:b w:val="false"/>
+          <w:bCs w:val="false"/>
+          <w:sz w:val="22"/>
+          <w:szCs w:val="22"/>
+        </w:rPr>
+        <w:t xml:space="preserve"> BAC Secretariat-Head</w:t>
       </w:r>
     </w:p>
     <w:sectPr>

</xml_diff>

<commit_message>
BAC docs test and reviewed, fixed placeholders and config
</commit_message>
<xml_diff>
--- a/public/docs/Bid Evaluation Report.docx
+++ b/public/docs/Bid Evaluation Report.docx
@@ -762,7 +762,7 @@
                 <w:sz w:val="22"/>
                 <w:szCs w:val="22"/>
               </w:rPr>
-              <w:t>Casiguran, Sorsogon</w:t>
+              <w:t>{{project_location}}</w:t>
             </w:r>
           </w:p>
           <w:p>
@@ -3092,7 +3092,27 @@
           <w:sz w:val="22"/>
           <w:szCs w:val="22"/>
         </w:rPr>
-        <w:t>submitted the Lowest Calculated Bid, offering the amounf of</w:t>
+        <w:t>submitted the Lowest Calculated Bid, offering the amoun</w:t>
+      </w:r>
+      <w:r>
+        <w:rPr>
+          <w:rFonts w:ascii="Verdana" w:hAnsi="Verdana"/>
+          <w:b w:val="false"/>
+          <w:bCs w:val="false"/>
+          <w:sz w:val="22"/>
+          <w:szCs w:val="22"/>
+        </w:rPr>
+        <w:t>t</w:t>
+      </w:r>
+      <w:r>
+        <w:rPr>
+          <w:rFonts w:ascii="Verdana" w:hAnsi="Verdana"/>
+          <w:b w:val="false"/>
+          <w:bCs w:val="false"/>
+          <w:sz w:val="22"/>
+          <w:szCs w:val="22"/>
+        </w:rPr>
+        <w:t xml:space="preserve"> of</w:t>
       </w:r>
       <w:r>
         <w:rPr>

</xml_diff>

<commit_message>
Bid eval docx fixed placeholder and config
</commit_message>
<xml_diff>
--- a/public/docs/Bid Evaluation Report.docx
+++ b/public/docs/Bid Evaluation Report.docx
@@ -1637,7 +1637,25 @@
                 <w:sz w:val="22"/>
                 <w:szCs w:val="22"/>
               </w:rPr>
-              <w:t>{{start_dateMonthDay}} - {{availability_date}}</w:t>
+              <w:t>{{start_dateMonthDay}} - {{availability_</w:t>
+            </w:r>
+            <w:r>
+              <w:rPr>
+                <w:rFonts w:ascii="Verdana" w:hAnsi="Verdana"/>
+                <w:iCs/>
+                <w:sz w:val="22"/>
+                <w:szCs w:val="22"/>
+              </w:rPr>
+              <w:t>end_</w:t>
+            </w:r>
+            <w:r>
+              <w:rPr>
+                <w:rFonts w:ascii="Verdana" w:hAnsi="Verdana"/>
+                <w:iCs/>
+                <w:sz w:val="22"/>
+                <w:szCs w:val="22"/>
+              </w:rPr>
+              <w:t>date}}</w:t>
             </w:r>
           </w:p>
           <w:p>
@@ -3092,27 +3110,7 @@
           <w:sz w:val="22"/>
           <w:szCs w:val="22"/>
         </w:rPr>
-        <w:t>submitted the Lowest Calculated Bid, offering the amoun</w:t>
-      </w:r>
-      <w:r>
-        <w:rPr>
-          <w:rFonts w:ascii="Verdana" w:hAnsi="Verdana"/>
-          <w:b w:val="false"/>
-          <w:bCs w:val="false"/>
-          <w:sz w:val="22"/>
-          <w:szCs w:val="22"/>
-        </w:rPr>
-        <w:t>t</w:t>
-      </w:r>
-      <w:r>
-        <w:rPr>
-          <w:rFonts w:ascii="Verdana" w:hAnsi="Verdana"/>
-          <w:b w:val="false"/>
-          <w:bCs w:val="false"/>
-          <w:sz w:val="22"/>
-          <w:szCs w:val="22"/>
-        </w:rPr>
-        <w:t xml:space="preserve"> of</w:t>
+        <w:t>submitted the Lowest Calculated Bid, offering the amount of</w:t>
       </w:r>
       <w:r>
         <w:rPr>

</xml_diff>